<commit_message>
Update the phase 1 report
</commit_message>
<xml_diff>
--- a/01_Data_Prep_EDA/Credit_Risk_Data_Prep_And_EDA_Report.docx
+++ b/01_Data_Prep_EDA/Credit_Risk_Data_Prep_And_EDA_Report.docx
@@ -8,7 +8,7 @@
         <w:jc w:val="center"/>
         <w:rPr>
           <w:rFonts w:ascii="Calibri" w:cs="Calibri" w:eastAsia="Calibri" w:hAnsi="Calibri"/>
-          <w:color w:val="4a86e8"/>
+          <w:color w:val="1f3864"/>
         </w:rPr>
       </w:pPr>
       <w:r>
@@ -16,7 +16,7 @@
           <w:rFonts w:ascii="Calibri" w:cs="Calibri" w:eastAsia="Calibri" w:hAnsi="Calibri"/>
           <w:b w:val="1"/>
           <w:bCs w:val="1"/>
-          <w:color w:val="4a86e8"/>
+          <w:color w:val="1f3864"/>
           <w:sz w:val="48"/>
           <w:szCs w:val="48"/>
           <w:rtl w:val="0"/>
@@ -65,7 +65,7 @@
           <w:szCs w:val="30"/>
           <w:rtl w:val="0"/>
         </w:rPr>
-        <w:t xml:space="preserve">Phase 2 Report: Data Preparation &amp; Exploratory Data Analysis</w:t>
+        <w:t xml:space="preserve">Phase 1 Report: Data Preparation &amp; Exploratory Data Analysis</w:t>
       </w:r>
       <w:r>
         <w:rPr>
@@ -198,15 +198,8 @@
     <w:p>
       <w:pPr>
         <w:pStyle w:val="Heading1"/>
-        <w:keepNext w:val="0"/>
-        <w:keepLines w:val="0"/>
-        <w:rPr>
-          <w:rFonts w:ascii="Calibri" w:cs="Calibri" w:eastAsia="Calibri" w:hAnsi="Calibri"/>
-          <w:b w:val="1"/>
-          <w:bCs w:val="1"/>
-          <w:color w:val="4a86e8"/>
-          <w:sz w:val="32"/>
-          <w:szCs w:val="32"/>
+        <w:rPr>
+          <w:color w:val="1f3864"/>
         </w:rPr>
       </w:pPr>
       <w:r>
@@ -4273,7 +4266,7 @@
     </w:p>
     <w:p>
       <w:pPr>
-        <w:pStyle w:val="Heading1"/>
+        <w:pStyle w:val="Heading2"/>
         <w:keepNext w:val="0"/>
         <w:keepLines w:val="0"/>
         <w:rPr/>
@@ -7144,12 +7137,12 @@
           <wp:inline distB="114300" distT="114300" distL="114300" distR="114300">
             <wp:extent cx="6572190" cy="2481337"/>
             <wp:effectExtent b="0" l="0" r="0" t="0"/>
-            <wp:docPr id="2" name="image3.png"/>
+            <wp:docPr id="2" name="image1.png"/>
             <a:graphic>
               <a:graphicData uri="http://schemas.openxmlformats.org/drawingml/2006/picture">
                 <pic:pic>
                   <pic:nvPicPr>
-                    <pic:cNvPr id="0" name="image3.png"/>
+                    <pic:cNvPr id="0" name="image1.png"/>
                     <pic:cNvPicPr preferRelativeResize="0"/>
                   </pic:nvPicPr>
                   <pic:blipFill>
@@ -7271,12 +7264,12 @@
           <wp:inline distB="114300" distT="114300" distL="114300" distR="114300">
             <wp:extent cx="6421746" cy="4140336"/>
             <wp:effectExtent b="0" l="0" r="0" t="0"/>
-            <wp:docPr id="4" name="image1.png"/>
+            <wp:docPr id="4" name="image4.png"/>
             <a:graphic>
               <a:graphicData uri="http://schemas.openxmlformats.org/drawingml/2006/picture">
                 <pic:pic>
                   <pic:nvPicPr>
-                    <pic:cNvPr id="0" name="image1.png"/>
+                    <pic:cNvPr id="0" name="image4.png"/>
                     <pic:cNvPicPr preferRelativeResize="0"/>
                   </pic:nvPicPr>
                   <pic:blipFill>
@@ -8074,12 +8067,12 @@
           <wp:inline distB="114300" distT="114300" distL="114300" distR="114300">
             <wp:extent cx="6543675" cy="1897388"/>
             <wp:effectExtent b="0" l="0" r="0" t="0"/>
-            <wp:docPr id="1" name="image4.png"/>
+            <wp:docPr id="1" name="image2.png"/>
             <a:graphic>
               <a:graphicData uri="http://schemas.openxmlformats.org/drawingml/2006/picture">
                 <pic:pic>
                   <pic:nvPicPr>
-                    <pic:cNvPr id="0" name="image4.png"/>
+                    <pic:cNvPr id="0" name="image2.png"/>
                     <pic:cNvPicPr preferRelativeResize="0"/>
                   </pic:nvPicPr>
                   <pic:blipFill>
@@ -8970,12 +8963,12 @@
           <wp:inline distB="114300" distT="114300" distL="114300" distR="114300">
             <wp:extent cx="6270859" cy="4355753"/>
             <wp:effectExtent b="0" l="0" r="0" t="0"/>
-            <wp:docPr id="3" name="image2.png"/>
+            <wp:docPr id="3" name="image3.png"/>
             <a:graphic>
               <a:graphicData uri="http://schemas.openxmlformats.org/drawingml/2006/picture">
                 <pic:pic>
                   <pic:nvPicPr>
-                    <pic:cNvPr id="0" name="image2.png"/>
+                    <pic:cNvPr id="0" name="image3.png"/>
                     <pic:cNvPicPr preferRelativeResize="0"/>
                   </pic:nvPicPr>
                   <pic:blipFill>
@@ -11467,7 +11460,7 @@
       <w:rFonts w:ascii="Calibri" w:cs="Calibri" w:eastAsia="Calibri" w:hAnsi="Calibri"/>
       <w:b w:val="1"/>
       <w:bCs w:val="1"/>
-      <w:color w:val="4a86e8"/>
+      <w:color w:val="1f3864"/>
       <w:sz w:val="32"/>
       <w:szCs w:val="32"/>
     </w:rPr>

</xml_diff>